<commit_message>
Filter detections to street objects so the roadside statue is not boxed
</commit_message>
<xml_diff>
--- a/short_report.docx
+++ b/short_report.docx
@@ -51,7 +51,7 @@
     </w:p>
     <w:p>
       <w:r>
-        <w:t>The model detected 10 objects in total. Seven of them were cars, with confidence scores from 0.58 up to 0.89. It also found one person at 0.47, one motorcycle at 0.42, and one object it labelled as a surfboard at 0.50.</w:t>
+        <w:t>After filtering, the model detected 9 objects. Seven of them were cars, with confidence scores from 0.58 up to 0.89. It also found one person at 0.47 and one motorcycle at 0.42 further down the road.</w:t>
       </w:r>
     </w:p>
     <w:p>
@@ -64,7 +64,7 @@
     </w:p>
     <w:p>
       <w:r>
-        <w:t>Mostly yes. Every clear car on the road was boxed correctly, and it also caught a person and a motorcycle further back. The one wrong call was a white roadside statue that it read as a surfboard. I left that mistake in the output instead of removing it, because it is an honest example of how a small model can be fooled by shape and color.</w:t>
+        <w:t>Mostly yes. Every clear car on the road was boxed correctly, and it also caught a person and a motorcycle further back. At first it also boxed a white roadside statue and called it a surfboard, because it was trained on everyday objects and has no class for statues. I added an allowlist of street objects so only traffic is drawn, which removed that wrong box.</w:t>
       </w:r>
     </w:p>
     <w:p>
@@ -77,7 +77,7 @@
     </w:p>
     <w:p>
       <w:r>
-        <w:t>I lowered the confidence threshold from 0.50 to 0.40 so more objects would show up, and I changed the bounding box color from red to green. I also added a printout of the total object count and every detected object name, and rewrote the Colab upload and display parts so the script reads the image from a file and saves the result on a normal computer.</w:t>
+        <w:t>I lowered the confidence threshold from 0.50 to 0.40 so more objects would show up, changed the bounding box color from red to green, and added a printout of the total object count and every detected object name. I also added an allowlist of street classes so only traffic gets drawn, and rewrote the Colab upload and display parts so the script reads the image from a file and saves the result on a normal computer.</w:t>
       </w:r>
     </w:p>
     <w:p>

</xml_diff>

<commit_message>
Use yolov5m at 1280px to detect the distant cars too
</commit_message>
<xml_diff>
--- a/short_report.docx
+++ b/short_report.docx
@@ -38,7 +38,7 @@
     </w:p>
     <w:p>
       <w:r>
-        <w:t>I used a photo of a busy city street with cars driving down the road, a few people on the side, and a motorcycle. It comes from Wikimedia Commons and is different from the demo image we used in class. I chose a crowded scene so the model would have several objects to find instead of just one.</w:t>
+        <w:t>I used a photo of a busy city street with cars driving down the road, people on the side, and several motorcycles. It comes from Wikimedia Commons and is different from the demo image we used in class. I chose a crowded scene on purpose so the model would have many objects to find.</w:t>
       </w:r>
     </w:p>
     <w:p>
@@ -51,7 +51,7 @@
     </w:p>
     <w:p>
       <w:r>
-        <w:t>After filtering, the model detected 9 objects. Seven of them were cars, with confidence scores from 0.58 up to 0.89. It also found one person at 0.47 and one motorcycle at 0.42 further down the road.</w:t>
+        <w:t>The model detected 32 objects across the scene: 14 cars, 9 people, 8 motorcycles, and 1 truck. The nearest cars came back with high confidence around 0.85 to 0.92, while the smaller, more distant objects sat lower, around 0.30 to 0.50.</w:t>
       </w:r>
     </w:p>
     <w:p>
@@ -64,7 +64,7 @@
     </w:p>
     <w:p>
       <w:r>
-        <w:t>Mostly yes. Every clear car on the road was boxed correctly, and it also caught a person and a motorcycle further back. At first it also boxed a white roadside statue and called it a surfboard, because it was trained on everyday objects and has no class for statues. I added an allowlist of street objects so only traffic is drawn, which removed that wrong box.</w:t>
+        <w:t>Yes, for the most part. Once I switched to the medium model and ran detection at 1280 pixels, it boxed not just the close cars but also the vehicles and people further down the road that the small model had missed. At first it also boxed a white roadside statue and called it a surfboard, because it was trained on everyday objects and has no class for statues. I added an allowlist of street objects so only traffic is drawn, which removed that wrong box.</w:t>
       </w:r>
     </w:p>
     <w:p>
@@ -77,7 +77,7 @@
     </w:p>
     <w:p>
       <w:r>
-        <w:t>I lowered the confidence threshold from 0.50 to 0.40 so more objects would show up, changed the bounding box color from red to green, and added a printout of the total object count and every detected object name. I also added an allowlist of street classes so only traffic gets drawn, and rewrote the Colab upload and display parts so the script reads the image from a file and saves the result on a normal computer.</w:t>
+        <w:t>I switched the model from yolov5s to yolov5m and ran detection at 1280 pixels so small distant cars would register. I lowered the confidence threshold from 0.50 to 0.30, changed the bounding box color from red to green, and added a printout of the total object count and every detected object name. I also added an allowlist of street classes so only traffic gets drawn, and rewrote the Colab upload and display parts so the script reads the image from a file and saves the result on a normal computer.</w:t>
       </w:r>
     </w:p>
     <w:p>

</xml_diff>